<commit_message>
Updated names and timings
</commit_message>
<xml_diff>
--- a/Outline/MiCM - Data Processing in Python Workshop Outline.docx
+++ b/Outline/MiCM - Data Processing in Python Workshop Outline.docx
@@ -133,7 +133,7 @@
           <w:szCs w:val="28"/>
           <w:lang w:val="en-CA"/>
         </w:rPr>
-        <w:t>Winter</w:t>
+        <w:t>Summer</w:t>
       </w:r>
       <w:r>
         <w:rPr>
@@ -220,8 +220,17 @@
           <w:bCs/>
           <w:lang w:val="en-CA"/>
         </w:rPr>
-        <w:t>Be</w:t>
-      </w:r>
+        <w:t>Sameena Karsan</w:t>
+      </w:r>
+    </w:p>
+    <w:p>
+      <w:pPr>
+        <w:spacing w:after="200" w:line="360" w:lineRule="auto"/>
+        <w:rPr>
+          <w:rFonts w:eastAsia="Calibri"/>
+          <w:lang w:val="en-CA"/>
+        </w:rPr>
+      </w:pPr>
       <w:r>
         <w:rPr>
           <w:rFonts w:eastAsia="Calibri"/>
@@ -229,7 +238,7 @@
           <w:bCs/>
           <w:lang w:val="en-CA"/>
         </w:rPr>
-        <w:t>n</w:t>
+        <w:t>Facilitator:</w:t>
       </w:r>
       <w:r>
         <w:rPr>
@@ -238,17 +247,8 @@
           <w:bCs/>
           <w:lang w:val="en-CA"/>
         </w:rPr>
-        <w:t>jamin Rudski</w:t>
-      </w:r>
-    </w:p>
-    <w:p>
-      <w:pPr>
-        <w:spacing w:after="200" w:line="360" w:lineRule="auto"/>
-        <w:rPr>
-          <w:rFonts w:eastAsia="Calibri"/>
-          <w:lang w:val="en-CA"/>
-        </w:rPr>
-      </w:pPr>
+        <w:t xml:space="preserve"> </w:t>
+      </w:r>
       <w:r>
         <w:rPr>
           <w:rFonts w:eastAsia="Calibri"/>
@@ -256,25 +256,7 @@
           <w:bCs/>
           <w:lang w:val="en-CA"/>
         </w:rPr>
-        <w:t>Facilitator:</w:t>
-      </w:r>
-      <w:r>
-        <w:rPr>
-          <w:rFonts w:eastAsia="Calibri"/>
-          <w:b/>
-          <w:bCs/>
-          <w:lang w:val="en-CA"/>
-        </w:rPr>
-        <w:t xml:space="preserve"> </w:t>
-      </w:r>
-      <w:r>
-        <w:rPr>
-          <w:rFonts w:eastAsia="Calibri"/>
-          <w:b/>
-          <w:bCs/>
-          <w:lang w:val="en-CA"/>
-        </w:rPr>
-        <w:t>James Randolph</w:t>
+        <w:t>Anna Zaider</w:t>
       </w:r>
     </w:p>
     <w:p>
@@ -336,7 +318,7 @@
           <w:bCs/>
           <w:lang w:val="en-CA"/>
         </w:rPr>
-        <w:t>4</w:t>
+        <w:t>2</w:t>
       </w:r>
       <w:r>
         <w:rPr>
@@ -635,7 +617,19 @@
         <w:rPr>
           <w:lang w:val="en-US"/>
         </w:rPr>
-        <w:t xml:space="preserve">In this 4-hour workshop, students will learn basic data processing skills using Python. Attendees will learn how to import code from other modules and packages to take advantage of the existing Python ecosystem. After seeing how to access packages, we will explore popular data analysis packages. We will see how to use NumPy to perform operations on large data arrays and how to use Matplotlib to generate clear data </w:t>
+        <w:t xml:space="preserve">In this </w:t>
+      </w:r>
+      <w:r>
+        <w:rPr>
+          <w:lang w:val="en-US"/>
+        </w:rPr>
+        <w:t>2</w:t>
+      </w:r>
+      <w:r>
+        <w:rPr>
+          <w:lang w:val="en-US"/>
+        </w:rPr>
+        <w:t xml:space="preserve">-hour workshop, students will learn basic data processing skills using Python. Attendees will learn how to import code from other modules and packages to take advantage of the existing Python ecosystem. After seeing how to access packages, we will explore popular data analysis packages. We will see how to use NumPy to perform operations on large data arrays and how to use Matplotlib to generate clear data </w:t>
       </w:r>
       <w:proofErr w:type="spellStart"/>
       <w:r>
@@ -864,7 +858,27 @@
           <w:sz w:val="22"/>
           <w:szCs w:val="22"/>
         </w:rPr>
-        <w:t>Module 1 – Modules and Packages (40 minutes)</w:t>
+        <w:t>Module 1 – Modules and Packages (</w:t>
+      </w:r>
+      <w:r>
+        <w:rPr>
+          <w:rFonts w:asciiTheme="minorBidi" w:hAnsiTheme="minorBidi"/>
+          <w:b/>
+          <w:bCs/>
+          <w:sz w:val="22"/>
+          <w:szCs w:val="22"/>
+        </w:rPr>
+        <w:t>2</w:t>
+      </w:r>
+      <w:r>
+        <w:rPr>
+          <w:rFonts w:asciiTheme="minorBidi" w:hAnsiTheme="minorBidi"/>
+          <w:b/>
+          <w:bCs/>
+          <w:sz w:val="22"/>
+          <w:szCs w:val="22"/>
+        </w:rPr>
+        <w:t>0 minutes)</w:t>
       </w:r>
     </w:p>
     <w:p>
@@ -1177,7 +1191,27 @@
           <w:sz w:val="22"/>
           <w:szCs w:val="22"/>
         </w:rPr>
-        <w:t>Module 2 – Introduction to NumPy Arrays (50 minutes)</w:t>
+        <w:t>Module 2 – Introduction to NumPy Arrays (</w:t>
+      </w:r>
+      <w:r>
+        <w:rPr>
+          <w:rFonts w:asciiTheme="minorBidi" w:hAnsiTheme="minorBidi"/>
+          <w:b/>
+          <w:bCs/>
+          <w:sz w:val="22"/>
+          <w:szCs w:val="22"/>
+        </w:rPr>
+        <w:t>3</w:t>
+      </w:r>
+      <w:r>
+        <w:rPr>
+          <w:rFonts w:asciiTheme="minorBidi" w:hAnsiTheme="minorBidi"/>
+          <w:b/>
+          <w:bCs/>
+          <w:sz w:val="22"/>
+          <w:szCs w:val="22"/>
+        </w:rPr>
+        <w:t>0 minutes)</w:t>
       </w:r>
     </w:p>
     <w:p>
@@ -1502,7 +1536,27 @@
           <w:sz w:val="22"/>
           <w:szCs w:val="22"/>
         </w:rPr>
-        <w:t xml:space="preserve"> Data with Matplotlib (50 minutes)</w:t>
+        <w:t xml:space="preserve"> Data with Matplotlib (</w:t>
+      </w:r>
+      <w:r>
+        <w:rPr>
+          <w:rFonts w:asciiTheme="minorBidi" w:hAnsiTheme="minorBidi"/>
+          <w:b/>
+          <w:bCs/>
+          <w:sz w:val="22"/>
+          <w:szCs w:val="22"/>
+        </w:rPr>
+        <w:t>3</w:t>
+      </w:r>
+      <w:r>
+        <w:rPr>
+          <w:rFonts w:asciiTheme="minorBidi" w:hAnsiTheme="minorBidi"/>
+          <w:b/>
+          <w:bCs/>
+          <w:sz w:val="22"/>
+          <w:szCs w:val="22"/>
+        </w:rPr>
+        <w:t>0 minutes)</w:t>
       </w:r>
     </w:p>
     <w:p>
@@ -1757,7 +1811,27 @@
           <w:sz w:val="22"/>
           <w:szCs w:val="22"/>
         </w:rPr>
-        <w:t>Module 4 – Intro to Tabular Data with Pandas (40 minutes)</w:t>
+        <w:t>Module 4 – Intro to Tabular Data with Pandas (</w:t>
+      </w:r>
+      <w:r>
+        <w:rPr>
+          <w:rFonts w:asciiTheme="minorBidi" w:hAnsiTheme="minorBidi"/>
+          <w:b/>
+          <w:bCs/>
+          <w:sz w:val="22"/>
+          <w:szCs w:val="22"/>
+        </w:rPr>
+        <w:t>3</w:t>
+      </w:r>
+      <w:r>
+        <w:rPr>
+          <w:rFonts w:asciiTheme="minorBidi" w:hAnsiTheme="minorBidi"/>
+          <w:b/>
+          <w:bCs/>
+          <w:sz w:val="22"/>
+          <w:szCs w:val="22"/>
+        </w:rPr>
+        <w:t>0 minutes)</w:t>
       </w:r>
     </w:p>
     <w:p>
@@ -5284,6 +5358,7 @@
   <w:style w:type="character" w:default="1" w:styleId="DefaultParagraphFont">
     <w:name w:val="Default Paragraph Font"/>
     <w:uiPriority w:val="1"/>
+    <w:semiHidden/>
     <w:unhideWhenUsed/>
   </w:style>
   <w:style w:type="table" w:default="1" w:styleId="TableNormal">

</xml_diff>